<commit_message>
Fix multiple bugs in product offering new form
</commit_message>
<xml_diff>
--- a/portal/bae-frontend/assets/documents/self-attestation-template.docx
+++ b/portal/bae-frontend/assets/documents/self-attestation-template.docx
@@ -1,6 +1,6 @@
 
 <file path=word/document.xml><?xml version="1.0" encoding="utf-8"?>
-<w:document xmlns:wpc="http://schemas.microsoft.com/office/word/2010/wordprocessingCanvas" xmlns:cx="http://schemas.microsoft.com/office/drawing/2014/chartex" xmlns:cx1="http://schemas.microsoft.com/office/drawing/2015/9/8/chartex" xmlns:cx2="http://schemas.microsoft.com/office/drawing/2015/10/21/chartex" xmlns:cx3="http://schemas.microsoft.com/office/drawing/2016/5/9/chartex" xmlns:cx4="http://schemas.microsoft.com/office/drawing/2016/5/10/chartex" xmlns:cx5="http://schemas.microsoft.com/office/drawing/2016/5/11/chartex" xmlns:cx6="http://schemas.microsoft.com/office/drawing/2016/5/12/chartex" xmlns:cx7="http://schemas.microsoft.com/office/drawing/2016/5/13/chartex" xmlns:cx8="http://schemas.microsoft.com/office/drawing/2016/5/14/chartex" xmlns:mc="http://schemas.openxmlformats.org/markup-compatibility/2006" xmlns:aink="http://schemas.microsoft.com/office/drawing/2016/ink" xmlns:am3d="http://schemas.microsoft.com/office/drawing/2017/model3d" xmlns:o="urn:schemas-microsoft-com:office:office" xmlns:oel="http://schemas.microsoft.com/office/2019/extlst" xmlns:r="http://schemas.openxmlformats.org/officeDocument/2006/relationships" xmlns:m="http://schemas.openxmlformats.org/officeDocument/2006/math" xmlns:v="urn:schemas-microsoft-com:vml" xmlns:wp14="http://schemas.microsoft.com/office/word/2010/wordprocessingDrawing" xmlns:wp="http://schemas.openxmlformats.org/drawingml/2006/wordprocessingDrawing" xmlns:w10="urn:schemas-microsoft-com:office:word" xmlns:w="http://schemas.openxmlformats.org/wordprocessingml/2006/main" xmlns:w14="http://schemas.microsoft.com/office/word/2010/wordml" xmlns:w15="http://schemas.microsoft.com/office/word/2012/wordml" xmlns:w16cex="http://schemas.microsoft.com/office/word/2018/wordml/cex" xmlns:w16cid="http://schemas.microsoft.com/office/word/2016/wordml/cid" xmlns:w16="http://schemas.microsoft.com/office/word/2018/wordml" xmlns:w16du="http://schemas.microsoft.com/office/word/2023/wordml/word16du" xmlns:w16sdtdh="http://schemas.microsoft.com/office/word/2020/wordml/sdtdatahash" xmlns:w16sdtfl="http://schemas.microsoft.com/office/word/2024/wordml/sdtformatlock" xmlns:w16se="http://schemas.microsoft.com/office/word/2015/wordml/symex" xmlns:wpg="http://schemas.microsoft.com/office/word/2010/wordprocessingGroup" xmlns:wpi="http://schemas.microsoft.com/office/word/2010/wordprocessingInk" xmlns:wne="http://schemas.microsoft.com/office/word/2006/wordml" xmlns:wps="http://schemas.microsoft.com/office/word/2010/wordprocessingShape" mc:Ignorable="w14 w15 w16se w16cid w16 w16cex w16sdtdh w16sdtfl w16du wp14">
+<w:document xmlns:wpc="http://schemas.microsoft.com/office/word/2010/wordprocessingCanvas" xmlns:cx="http://schemas.microsoft.com/office/drawing/2014/chartex" xmlns:cx1="http://schemas.microsoft.com/office/drawing/2015/9/8/chartex" xmlns:cx2="http://schemas.microsoft.com/office/drawing/2015/10/21/chartex" xmlns:cx3="http://schemas.microsoft.com/office/drawing/2016/5/9/chartex" xmlns:cx4="http://schemas.microsoft.com/office/drawing/2016/5/10/chartex" xmlns:cx5="http://schemas.microsoft.com/office/drawing/2016/5/11/chartex" xmlns:cx6="http://schemas.microsoft.com/office/drawing/2016/5/12/chartex" xmlns:cx7="http://schemas.microsoft.com/office/drawing/2016/5/13/chartex" xmlns:cx8="http://schemas.microsoft.com/office/drawing/2016/5/14/chartex" xmlns:mc="http://schemas.openxmlformats.org/markup-compatibility/2006" xmlns:aink="http://schemas.microsoft.com/office/drawing/2016/ink" xmlns:am3d="http://schemas.microsoft.com/office/drawing/2017/model3d" xmlns:o="urn:schemas-microsoft-com:office:office" xmlns:oel="http://schemas.microsoft.com/office/2019/extlst" xmlns:r="http://schemas.openxmlformats.org/officeDocument/2006/relationships" xmlns:m="http://schemas.openxmlformats.org/officeDocument/2006/math" xmlns:v="urn:schemas-microsoft-com:vml" xmlns:wp14="http://schemas.microsoft.com/office/word/2010/wordprocessingDrawing" xmlns:wp="http://schemas.openxmlformats.org/drawingml/2006/wordprocessingDrawing" xmlns:w10="urn:schemas-microsoft-com:office:word" xmlns:w="http://schemas.openxmlformats.org/wordprocessingml/2006/main" xmlns:w14="http://schemas.microsoft.com/office/word/2010/wordml" xmlns:w15="http://schemas.microsoft.com/office/word/2012/wordml" xmlns:w16cex="http://schemas.microsoft.com/office/word/2018/wordml/cex" xmlns:w16cid="http://schemas.microsoft.com/office/word/2016/wordml/cid" xmlns:w16="http://schemas.microsoft.com/office/word/2018/wordml" xmlns:w16sdtdh="http://schemas.microsoft.com/office/word/2020/wordml/sdtdatahash" xmlns:w16se="http://schemas.microsoft.com/office/word/2015/wordml/symex" xmlns:wpg="http://schemas.microsoft.com/office/word/2010/wordprocessingGroup" xmlns:wpi="http://schemas.microsoft.com/office/word/2010/wordprocessingInk" xmlns:wne="http://schemas.microsoft.com/office/word/2006/wordml" xmlns:wps="http://schemas.microsoft.com/office/word/2010/wordprocessingShape" mc:Ignorable="w14 w15 w16se w16cid w16 w16cex w16sdtdh wp14">
   <w:body>
     <w:p>
       <w:pPr>
@@ -125,14 +125,6 @@
         </w:rPr>
         <w:t xml:space="preserve">Date: </w:t>
       </w:r>
-      <w:r>
-        <w:rPr>
-          <w:b/>
-          <w:i/>
-          <w:color w:val="000000"/>
-        </w:rPr>
-        <w:t>2025 06 23</w:t>
-      </w:r>
     </w:p>
     <w:p>
       <w:pPr>
@@ -184,11 +176,7 @@
           <w:tcPr>
             <w:tcW w:w="5238" w:type="dxa"/>
           </w:tcPr>
-          <w:p>
-            <w:r>
-              <w:t xml:space="preserve">Fabio </w:t>
-            </w:r>
-          </w:p>
+          <w:p/>
         </w:tc>
       </w:tr>
       <w:tr>
@@ -206,11 +194,7 @@
           <w:tcPr>
             <w:tcW w:w="5238" w:type="dxa"/>
           </w:tcPr>
-          <w:p>
-            <w:r>
-              <w:t>Momola</w:t>
-            </w:r>
-          </w:p>
+          <w:p/>
         </w:tc>
       </w:tr>
       <w:tr>
@@ -228,11 +212,7 @@
           <w:tcPr>
             <w:tcW w:w="5238" w:type="dxa"/>
           </w:tcPr>
-          <w:p>
-            <w:r>
-              <w:t>Fabio.momola@eng.it</w:t>
-            </w:r>
-          </w:p>
+          <w:p/>
         </w:tc>
       </w:tr>
     </w:tbl>
@@ -309,11 +289,7 @@
           <w:tcPr>
             <w:tcW w:w="5238" w:type="dxa"/>
           </w:tcPr>
-          <w:p>
-            <w:r>
-              <w:t>Engineering D.HUB S.p.A.</w:t>
-            </w:r>
-          </w:p>
+          <w:p/>
         </w:tc>
       </w:tr>
     </w:tbl>
@@ -380,19 +356,7 @@
           <w:tcPr>
             <w:tcW w:w="5238" w:type="dxa"/>
           </w:tcPr>
-          <w:p>
-            <w:r>
-              <w:t xml:space="preserve">Virtual data </w:t>
-            </w:r>
-            <w:proofErr w:type="spellStart"/>
-            <w:r>
-              <w:t>center</w:t>
-            </w:r>
-            <w:proofErr w:type="spellEnd"/>
-            <w:r>
-              <w:t xml:space="preserve"> </w:t>
-            </w:r>
-          </w:p>
+          <w:p/>
         </w:tc>
       </w:tr>
     </w:tbl>
@@ -770,21 +734,7 @@
               <w:rPr>
                 <w:color w:val="000000"/>
               </w:rPr>
-              <w:t xml:space="preserve">The Company, when a Cloud Customer is contracting the Offering, offers a written contract under </w:t>
-            </w:r>
-            <w:proofErr w:type="gramStart"/>
-            <w:r>
-              <w:rPr>
-                <w:color w:val="000000"/>
-              </w:rPr>
-              <w:t>a</w:t>
-            </w:r>
-            <w:proofErr w:type="gramEnd"/>
-            <w:r>
-              <w:rPr>
-                <w:color w:val="000000"/>
-              </w:rPr>
-              <w:t xml:space="preserve"> EU/EEA/Member State law and specifically addressing GDPR requirements.</w:t>
+              <w:t>The Company, when a Cloud Customer is contracting the Offering, offers a written contract under a EU/EEA/Member State law and specifically addressing GDPR requirements.</w:t>
             </w:r>
           </w:p>
         </w:tc>
@@ -813,12 +763,6 @@
                 <w:color w:val="000000"/>
               </w:rPr>
             </w:pPr>
-            <w:r>
-              <w:rPr>
-                <w:color w:val="000000"/>
-              </w:rPr>
-              <w:t>Yes</w:t>
-            </w:r>
           </w:p>
         </w:tc>
       </w:tr>
@@ -978,12 +922,6 @@
                 <w:color w:val="000000"/>
               </w:rPr>
             </w:pPr>
-            <w:r>
-              <w:rPr>
-                <w:color w:val="000000"/>
-              </w:rPr>
-              <w:t>Yes</w:t>
-            </w:r>
           </w:p>
         </w:tc>
       </w:tr>
@@ -1143,12 +1081,6 @@
                 <w:color w:val="000000"/>
               </w:rPr>
             </w:pPr>
-            <w:r>
-              <w:rPr>
-                <w:color w:val="000000"/>
-              </w:rPr>
-              <w:t>Yes</w:t>
-            </w:r>
           </w:p>
         </w:tc>
       </w:tr>
@@ -1308,12 +1240,6 @@
                 <w:color w:val="000000"/>
               </w:rPr>
             </w:pPr>
-            <w:r>
-              <w:rPr>
-                <w:color w:val="000000"/>
-              </w:rPr>
-              <w:t>Yes</w:t>
-            </w:r>
           </w:p>
         </w:tc>
       </w:tr>
@@ -1473,12 +1399,6 @@
                 <w:color w:val="000000"/>
               </w:rPr>
             </w:pPr>
-            <w:r>
-              <w:rPr>
-                <w:color w:val="000000"/>
-              </w:rPr>
-              <w:t>Yes</w:t>
-            </w:r>
           </w:p>
         </w:tc>
       </w:tr>
@@ -1638,12 +1558,6 @@
                 <w:color w:val="000000"/>
               </w:rPr>
             </w:pPr>
-            <w:r>
-              <w:rPr>
-                <w:color w:val="000000"/>
-              </w:rPr>
-              <w:t>Yes</w:t>
-            </w:r>
           </w:p>
         </w:tc>
       </w:tr>
@@ -1803,12 +1717,6 @@
                 <w:color w:val="000000"/>
               </w:rPr>
             </w:pPr>
-            <w:r>
-              <w:rPr>
-                <w:color w:val="000000"/>
-              </w:rPr>
-              <w:t>Yes</w:t>
-            </w:r>
           </w:p>
         </w:tc>
       </w:tr>
@@ -1939,21 +1847,7 @@
               <w:rPr>
                 <w:color w:val="000000"/>
               </w:rPr>
-              <w:t xml:space="preserve">Risk Management: </w:t>
-            </w:r>
-            <w:proofErr w:type="gramStart"/>
-            <w:r>
-              <w:rPr>
-                <w:color w:val="000000"/>
-              </w:rPr>
-              <w:t>the</w:t>
-            </w:r>
-            <w:proofErr w:type="gramEnd"/>
-            <w:r>
-              <w:rPr>
-                <w:color w:val="000000"/>
-              </w:rPr>
-              <w:t xml:space="preserve"> Company ensures that risks related to information security are properly identified, assessed, and treated, and that the residual risk is acceptable to the Company pursuant to its own criteria.</w:t>
+              <w:t>Risk Management: the Company ensures that risks related to information security are properly identified, assessed, and treated, and that the residual risk is acceptable to the Company pursuant to its own criteria.</w:t>
             </w:r>
           </w:p>
         </w:tc>
@@ -1982,12 +1876,6 @@
                 <w:color w:val="000000"/>
               </w:rPr>
             </w:pPr>
-            <w:r>
-              <w:rPr>
-                <w:color w:val="000000"/>
-              </w:rPr>
-              <w:t>Yes</w:t>
-            </w:r>
           </w:p>
         </w:tc>
       </w:tr>
@@ -2147,12 +2035,6 @@
                 <w:color w:val="000000"/>
               </w:rPr>
             </w:pPr>
-            <w:r>
-              <w:rPr>
-                <w:color w:val="000000"/>
-              </w:rPr>
-              <w:t>Yes</w:t>
-            </w:r>
           </w:p>
         </w:tc>
       </w:tr>
@@ -2312,12 +2194,6 @@
                 <w:color w:val="000000"/>
               </w:rPr>
             </w:pPr>
-            <w:r>
-              <w:rPr>
-                <w:color w:val="000000"/>
-              </w:rPr>
-              <w:t>Yes</w:t>
-            </w:r>
           </w:p>
         </w:tc>
       </w:tr>
@@ -2477,12 +2353,6 @@
                 <w:color w:val="000000"/>
               </w:rPr>
             </w:pPr>
-            <w:r>
-              <w:rPr>
-                <w:color w:val="000000"/>
-              </w:rPr>
-              <w:t>Yes</w:t>
-            </w:r>
           </w:p>
         </w:tc>
       </w:tr>
@@ -2642,12 +2512,6 @@
                 <w:color w:val="000000"/>
               </w:rPr>
             </w:pPr>
-            <w:r>
-              <w:rPr>
-                <w:color w:val="000000"/>
-              </w:rPr>
-              <w:t>Yes</w:t>
-            </w:r>
           </w:p>
         </w:tc>
       </w:tr>
@@ -2807,12 +2671,6 @@
                 <w:color w:val="000000"/>
               </w:rPr>
             </w:pPr>
-            <w:r>
-              <w:rPr>
-                <w:color w:val="000000"/>
-              </w:rPr>
-              <w:t>Yes</w:t>
-            </w:r>
           </w:p>
         </w:tc>
       </w:tr>
@@ -2972,12 +2830,6 @@
                 <w:color w:val="000000"/>
               </w:rPr>
             </w:pPr>
-            <w:r>
-              <w:rPr>
-                <w:color w:val="000000"/>
-              </w:rPr>
-              <w:t>Yes</w:t>
-            </w:r>
           </w:p>
         </w:tc>
       </w:tr>
@@ -3137,12 +2989,6 @@
                 <w:color w:val="000000"/>
               </w:rPr>
             </w:pPr>
-            <w:r>
-              <w:rPr>
-                <w:color w:val="000000"/>
-              </w:rPr>
-              <w:t>Yes</w:t>
-            </w:r>
           </w:p>
         </w:tc>
       </w:tr>
@@ -3302,12 +3148,6 @@
                 <w:color w:val="000000"/>
               </w:rPr>
             </w:pPr>
-            <w:r>
-              <w:rPr>
-                <w:color w:val="000000"/>
-              </w:rPr>
-              <w:t>Yes</w:t>
-            </w:r>
           </w:p>
         </w:tc>
       </w:tr>
@@ -3438,21 +3278,7 @@
               <w:rPr>
                 <w:color w:val="000000"/>
               </w:rPr>
-              <w:t xml:space="preserve">Change and Configuration Management: </w:t>
-            </w:r>
-            <w:proofErr w:type="gramStart"/>
-            <w:r>
-              <w:rPr>
-                <w:color w:val="000000"/>
-              </w:rPr>
-              <w:t>the</w:t>
-            </w:r>
-            <w:proofErr w:type="gramEnd"/>
-            <w:r>
-              <w:rPr>
-                <w:color w:val="000000"/>
-              </w:rPr>
-              <w:t xml:space="preserve"> Company ensures that changes and configuration actions to information systems maintain an adequate security of the Offering.</w:t>
+              <w:t>Change and Configuration Management: the Company ensures that changes and configuration actions to information systems maintain an adequate security of the Offering.</w:t>
             </w:r>
           </w:p>
         </w:tc>
@@ -3481,12 +3307,6 @@
                 <w:color w:val="000000"/>
               </w:rPr>
             </w:pPr>
-            <w:r>
-              <w:rPr>
-                <w:color w:val="000000"/>
-              </w:rPr>
-              <w:t>Yes</w:t>
-            </w:r>
           </w:p>
         </w:tc>
       </w:tr>
@@ -3646,12 +3466,6 @@
                 <w:color w:val="000000"/>
               </w:rPr>
             </w:pPr>
-            <w:r>
-              <w:rPr>
-                <w:color w:val="000000"/>
-              </w:rPr>
-              <w:t>Yes</w:t>
-            </w:r>
           </w:p>
         </w:tc>
       </w:tr>
@@ -3811,12 +3625,6 @@
                 <w:color w:val="000000"/>
               </w:rPr>
             </w:pPr>
-            <w:r>
-              <w:rPr>
-                <w:color w:val="000000"/>
-              </w:rPr>
-              <w:t>Yes</w:t>
-            </w:r>
           </w:p>
         </w:tc>
       </w:tr>
@@ -3976,12 +3784,6 @@
                 <w:color w:val="000000"/>
               </w:rPr>
             </w:pPr>
-            <w:r>
-              <w:rPr>
-                <w:color w:val="000000"/>
-              </w:rPr>
-              <w:t>Yes</w:t>
-            </w:r>
           </w:p>
         </w:tc>
       </w:tr>
@@ -4141,12 +3943,6 @@
                 <w:color w:val="000000"/>
               </w:rPr>
             </w:pPr>
-            <w:r>
-              <w:rPr>
-                <w:color w:val="000000"/>
-              </w:rPr>
-              <w:t>Yes</w:t>
-            </w:r>
           </w:p>
         </w:tc>
       </w:tr>
@@ -4306,12 +4102,6 @@
                 <w:color w:val="000000"/>
               </w:rPr>
             </w:pPr>
-            <w:r>
-              <w:rPr>
-                <w:color w:val="000000"/>
-              </w:rPr>
-              <w:t>Yes</w:t>
-            </w:r>
           </w:p>
         </w:tc>
       </w:tr>
@@ -4471,12 +4261,6 @@
                 <w:color w:val="000000"/>
               </w:rPr>
             </w:pPr>
-            <w:r>
-              <w:rPr>
-                <w:color w:val="000000"/>
-              </w:rPr>
-              <w:t>Yes</w:t>
-            </w:r>
           </w:p>
         </w:tc>
       </w:tr>
@@ -4636,12 +4420,6 @@
                 <w:color w:val="000000"/>
               </w:rPr>
             </w:pPr>
-            <w:r>
-              <w:rPr>
-                <w:color w:val="000000"/>
-              </w:rPr>
-              <w:t>Yes</w:t>
-            </w:r>
           </w:p>
         </w:tc>
       </w:tr>
@@ -4800,12 +4578,6 @@
                 <w:color w:val="000000"/>
               </w:rPr>
             </w:pPr>
-            <w:r>
-              <w:rPr>
-                <w:color w:val="000000"/>
-              </w:rPr>
-              <w:t>NO</w:t>
-            </w:r>
           </w:p>
         </w:tc>
       </w:tr>
@@ -4964,12 +4736,6 @@
                 <w:color w:val="000000"/>
               </w:rPr>
             </w:pPr>
-            <w:r>
-              <w:rPr>
-                <w:color w:val="666666"/>
-              </w:rPr>
-              <w:t>NO</w:t>
-            </w:r>
           </w:p>
         </w:tc>
       </w:tr>
@@ -5128,12 +4894,6 @@
                 <w:color w:val="000000"/>
               </w:rPr>
             </w:pPr>
-            <w:r>
-              <w:rPr>
-                <w:color w:val="666666"/>
-              </w:rPr>
-              <w:t>YES</w:t>
-            </w:r>
           </w:p>
         </w:tc>
       </w:tr>
@@ -5292,12 +5052,6 @@
                 <w:color w:val="000000"/>
               </w:rPr>
             </w:pPr>
-            <w:r>
-              <w:rPr>
-                <w:color w:val="666666"/>
-              </w:rPr>
-              <w:t>NO</w:t>
-            </w:r>
           </w:p>
         </w:tc>
       </w:tr>
@@ -5456,12 +5210,6 @@
                 <w:color w:val="000000"/>
               </w:rPr>
             </w:pPr>
-            <w:r>
-              <w:rPr>
-                <w:color w:val="666666"/>
-              </w:rPr>
-              <w:t>YES</w:t>
-            </w:r>
           </w:p>
         </w:tc>
       </w:tr>
@@ -5620,12 +5368,6 @@
                 <w:color w:val="000000"/>
               </w:rPr>
             </w:pPr>
-            <w:r>
-              <w:rPr>
-                <w:color w:val="666666"/>
-              </w:rPr>
-              <w:t>NO</w:t>
-            </w:r>
           </w:p>
         </w:tc>
       </w:tr>
@@ -5784,12 +5526,6 @@
                 <w:color w:val="000000"/>
               </w:rPr>
             </w:pPr>
-            <w:r>
-              <w:rPr>
-                <w:color w:val="666666"/>
-              </w:rPr>
-              <w:t>NO</w:t>
-            </w:r>
           </w:p>
         </w:tc>
       </w:tr>
@@ -5948,12 +5684,6 @@
                 <w:color w:val="000000"/>
               </w:rPr>
             </w:pPr>
-            <w:r>
-              <w:rPr>
-                <w:color w:val="666666"/>
-              </w:rPr>
-              <w:t>YES</w:t>
-            </w:r>
           </w:p>
         </w:tc>
       </w:tr>
@@ -6112,12 +5842,6 @@
                 <w:color w:val="000000"/>
               </w:rPr>
             </w:pPr>
-            <w:r>
-              <w:rPr>
-                <w:color w:val="666666"/>
-              </w:rPr>
-              <w:t>YES</w:t>
-            </w:r>
           </w:p>
         </w:tc>
       </w:tr>
@@ -6247,21 +5971,7 @@
               <w:rPr>
                 <w:color w:val="000000"/>
               </w:rPr>
-              <w:t xml:space="preserve">If the Company or any of its subcontractors is subject to legal obligations to transmit or disclose Cloud Customer personal data </w:t>
-            </w:r>
-            <w:proofErr w:type="gramStart"/>
-            <w:r>
-              <w:rPr>
-                <w:color w:val="000000"/>
-              </w:rPr>
-              <w:t>on the basis of</w:t>
-            </w:r>
-            <w:proofErr w:type="gramEnd"/>
-            <w:r>
-              <w:rPr>
-                <w:color w:val="000000"/>
-              </w:rPr>
-              <w:t xml:space="preserve"> a non-EU/EEA statutory order, the Company has verified safeguards in place to ensure that any access request is compliant with EU/EEA/Member State law.</w:t>
+              <w:t>If the Company or any of its subcontractors is subject to legal obligations to transmit or disclose Cloud Customer personal data on the basis of a non-EU/EEA statutory order, the Company has verified safeguards in place to ensure that any access request is compliant with EU/EEA/Member State law.</w:t>
             </w:r>
           </w:p>
         </w:tc>
@@ -6290,12 +6000,6 @@
                 <w:color w:val="000000"/>
               </w:rPr>
             </w:pPr>
-            <w:r>
-              <w:rPr>
-                <w:color w:val="666666"/>
-              </w:rPr>
-              <w:t>YES</w:t>
-            </w:r>
           </w:p>
         </w:tc>
       </w:tr>
@@ -6454,12 +6158,6 @@
                 <w:color w:val="000000"/>
               </w:rPr>
             </w:pPr>
-            <w:r>
-              <w:rPr>
-                <w:color w:val="666666"/>
-              </w:rPr>
-              <w:t>YES</w:t>
-            </w:r>
           </w:p>
         </w:tc>
       </w:tr>
@@ -6618,12 +6316,6 @@
                 <w:color w:val="000000"/>
               </w:rPr>
             </w:pPr>
-            <w:r>
-              <w:rPr>
-                <w:color w:val="666666"/>
-              </w:rPr>
-              <w:t>YES</w:t>
-            </w:r>
           </w:p>
         </w:tc>
       </w:tr>
@@ -6782,12 +6474,6 @@
                 <w:color w:val="000000"/>
               </w:rPr>
             </w:pPr>
-            <w:r>
-              <w:rPr>
-                <w:color w:val="666666"/>
-              </w:rPr>
-              <w:t>YES</w:t>
-            </w:r>
           </w:p>
         </w:tc>
       </w:tr>
@@ -6946,12 +6632,6 @@
                 <w:color w:val="000000"/>
               </w:rPr>
             </w:pPr>
-            <w:r>
-              <w:rPr>
-                <w:color w:val="666666"/>
-              </w:rPr>
-              <w:t>YES</w:t>
-            </w:r>
           </w:p>
         </w:tc>
       </w:tr>
@@ -7116,17 +6796,7 @@
               </w:rPr>
             </w:pPr>
             <w:r>
-              <w:t>Signed: Mr</w:t>
-            </w:r>
-            <w:r>
-              <w:t xml:space="preserve">. </w:t>
-            </w:r>
-            <w:r>
-              <w:rPr>
-                <w:i/>
-                <w:iCs/>
-              </w:rPr>
-              <w:t>Fabio Momola</w:t>
+              <w:t xml:space="preserve">Signed: </w:t>
             </w:r>
           </w:p>
         </w:tc>
@@ -7146,7 +6816,7 @@
 </file>
 
 <file path=word/endnotes.xml><?xml version="1.0" encoding="utf-8"?>
-<w:endnotes xmlns:wpc="http://schemas.microsoft.com/office/word/2010/wordprocessingCanvas" xmlns:cx="http://schemas.microsoft.com/office/drawing/2014/chartex" xmlns:cx1="http://schemas.microsoft.com/office/drawing/2015/9/8/chartex" xmlns:cx2="http://schemas.microsoft.com/office/drawing/2015/10/21/chartex" xmlns:cx3="http://schemas.microsoft.com/office/drawing/2016/5/9/chartex" xmlns:cx4="http://schemas.microsoft.com/office/drawing/2016/5/10/chartex" xmlns:cx5="http://schemas.microsoft.com/office/drawing/2016/5/11/chartex" xmlns:cx6="http://schemas.microsoft.com/office/drawing/2016/5/12/chartex" xmlns:cx7="http://schemas.microsoft.com/office/drawing/2016/5/13/chartex" xmlns:cx8="http://schemas.microsoft.com/office/drawing/2016/5/14/chartex" xmlns:mc="http://schemas.openxmlformats.org/markup-compatibility/2006" xmlns:aink="http://schemas.microsoft.com/office/drawing/2016/ink" xmlns:am3d="http://schemas.microsoft.com/office/drawing/2017/model3d" xmlns:o="urn:schemas-microsoft-com:office:office" xmlns:oel="http://schemas.microsoft.com/office/2019/extlst" xmlns:r="http://schemas.openxmlformats.org/officeDocument/2006/relationships" xmlns:m="http://schemas.openxmlformats.org/officeDocument/2006/math" xmlns:v="urn:schemas-microsoft-com:vml" xmlns:wp14="http://schemas.microsoft.com/office/word/2010/wordprocessingDrawing" xmlns:wp="http://schemas.openxmlformats.org/drawingml/2006/wordprocessingDrawing" xmlns:w10="urn:schemas-microsoft-com:office:word" xmlns:w="http://schemas.openxmlformats.org/wordprocessingml/2006/main" xmlns:w14="http://schemas.microsoft.com/office/word/2010/wordml" xmlns:w15="http://schemas.microsoft.com/office/word/2012/wordml" xmlns:w16cex="http://schemas.microsoft.com/office/word/2018/wordml/cex" xmlns:w16cid="http://schemas.microsoft.com/office/word/2016/wordml/cid" xmlns:w16="http://schemas.microsoft.com/office/word/2018/wordml" xmlns:w16du="http://schemas.microsoft.com/office/word/2023/wordml/word16du" xmlns:w16sdtdh="http://schemas.microsoft.com/office/word/2020/wordml/sdtdatahash" xmlns:w16sdtfl="http://schemas.microsoft.com/office/word/2024/wordml/sdtformatlock" xmlns:w16se="http://schemas.microsoft.com/office/word/2015/wordml/symex" xmlns:wpg="http://schemas.microsoft.com/office/word/2010/wordprocessingGroup" xmlns:wpi="http://schemas.microsoft.com/office/word/2010/wordprocessingInk" xmlns:wne="http://schemas.microsoft.com/office/word/2006/wordml" xmlns:wps="http://schemas.microsoft.com/office/word/2010/wordprocessingShape" mc:Ignorable="w14 w15 w16se w16cid w16 w16cex w16sdtdh w16sdtfl w16du wp14">
+<w:endnotes xmlns:wpc="http://schemas.microsoft.com/office/word/2010/wordprocessingCanvas" xmlns:cx="http://schemas.microsoft.com/office/drawing/2014/chartex" xmlns:cx1="http://schemas.microsoft.com/office/drawing/2015/9/8/chartex" xmlns:cx2="http://schemas.microsoft.com/office/drawing/2015/10/21/chartex" xmlns:cx3="http://schemas.microsoft.com/office/drawing/2016/5/9/chartex" xmlns:cx4="http://schemas.microsoft.com/office/drawing/2016/5/10/chartex" xmlns:cx5="http://schemas.microsoft.com/office/drawing/2016/5/11/chartex" xmlns:cx6="http://schemas.microsoft.com/office/drawing/2016/5/12/chartex" xmlns:cx7="http://schemas.microsoft.com/office/drawing/2016/5/13/chartex" xmlns:cx8="http://schemas.microsoft.com/office/drawing/2016/5/14/chartex" xmlns:mc="http://schemas.openxmlformats.org/markup-compatibility/2006" xmlns:aink="http://schemas.microsoft.com/office/drawing/2016/ink" xmlns:am3d="http://schemas.microsoft.com/office/drawing/2017/model3d" xmlns:o="urn:schemas-microsoft-com:office:office" xmlns:oel="http://schemas.microsoft.com/office/2019/extlst" xmlns:r="http://schemas.openxmlformats.org/officeDocument/2006/relationships" xmlns:m="http://schemas.openxmlformats.org/officeDocument/2006/math" xmlns:v="urn:schemas-microsoft-com:vml" xmlns:wp14="http://schemas.microsoft.com/office/word/2010/wordprocessingDrawing" xmlns:wp="http://schemas.openxmlformats.org/drawingml/2006/wordprocessingDrawing" xmlns:w10="urn:schemas-microsoft-com:office:word" xmlns:w="http://schemas.openxmlformats.org/wordprocessingml/2006/main" xmlns:w14="http://schemas.microsoft.com/office/word/2010/wordml" xmlns:w15="http://schemas.microsoft.com/office/word/2012/wordml" xmlns:w16cex="http://schemas.microsoft.com/office/word/2018/wordml/cex" xmlns:w16cid="http://schemas.microsoft.com/office/word/2016/wordml/cid" xmlns:w16="http://schemas.microsoft.com/office/word/2018/wordml" xmlns:w16sdtdh="http://schemas.microsoft.com/office/word/2020/wordml/sdtdatahash" xmlns:w16se="http://schemas.microsoft.com/office/word/2015/wordml/symex" xmlns:wpg="http://schemas.microsoft.com/office/word/2010/wordprocessingGroup" xmlns:wpi="http://schemas.microsoft.com/office/word/2010/wordprocessingInk" xmlns:wne="http://schemas.microsoft.com/office/word/2006/wordml" xmlns:wps="http://schemas.microsoft.com/office/word/2010/wordprocessingShape" mc:Ignorable="w14 w15 w16se w16cid w16 w16cex w16sdtdh wp14">
   <w:endnote w:type="separator" w:id="-1">
     <w:p>
       <w:pPr>
@@ -7171,7 +6841,7 @@
 </file>
 
 <file path=word/footer1.xml><?xml version="1.0" encoding="utf-8"?>
-<w:ftr xmlns:wpc="http://schemas.microsoft.com/office/word/2010/wordprocessingCanvas" xmlns:cx="http://schemas.microsoft.com/office/drawing/2014/chartex" xmlns:cx1="http://schemas.microsoft.com/office/drawing/2015/9/8/chartex" xmlns:cx2="http://schemas.microsoft.com/office/drawing/2015/10/21/chartex" xmlns:cx3="http://schemas.microsoft.com/office/drawing/2016/5/9/chartex" xmlns:cx4="http://schemas.microsoft.com/office/drawing/2016/5/10/chartex" xmlns:cx5="http://schemas.microsoft.com/office/drawing/2016/5/11/chartex" xmlns:cx6="http://schemas.microsoft.com/office/drawing/2016/5/12/chartex" xmlns:cx7="http://schemas.microsoft.com/office/drawing/2016/5/13/chartex" xmlns:cx8="http://schemas.microsoft.com/office/drawing/2016/5/14/chartex" xmlns:mc="http://schemas.openxmlformats.org/markup-compatibility/2006" xmlns:aink="http://schemas.microsoft.com/office/drawing/2016/ink" xmlns:am3d="http://schemas.microsoft.com/office/drawing/2017/model3d" xmlns:o="urn:schemas-microsoft-com:office:office" xmlns:oel="http://schemas.microsoft.com/office/2019/extlst" xmlns:r="http://schemas.openxmlformats.org/officeDocument/2006/relationships" xmlns:m="http://schemas.openxmlformats.org/officeDocument/2006/math" xmlns:v="urn:schemas-microsoft-com:vml" xmlns:wp14="http://schemas.microsoft.com/office/word/2010/wordprocessingDrawing" xmlns:wp="http://schemas.openxmlformats.org/drawingml/2006/wordprocessingDrawing" xmlns:w10="urn:schemas-microsoft-com:office:word" xmlns:w="http://schemas.openxmlformats.org/wordprocessingml/2006/main" xmlns:w14="http://schemas.microsoft.com/office/word/2010/wordml" xmlns:w15="http://schemas.microsoft.com/office/word/2012/wordml" xmlns:w16cex="http://schemas.microsoft.com/office/word/2018/wordml/cex" xmlns:w16cid="http://schemas.microsoft.com/office/word/2016/wordml/cid" xmlns:w16="http://schemas.microsoft.com/office/word/2018/wordml" xmlns:w16du="http://schemas.microsoft.com/office/word/2023/wordml/word16du" xmlns:w16sdtdh="http://schemas.microsoft.com/office/word/2020/wordml/sdtdatahash" xmlns:w16sdtfl="http://schemas.microsoft.com/office/word/2024/wordml/sdtformatlock" xmlns:w16se="http://schemas.microsoft.com/office/word/2015/wordml/symex" xmlns:wpg="http://schemas.microsoft.com/office/word/2010/wordprocessingGroup" xmlns:wpi="http://schemas.microsoft.com/office/word/2010/wordprocessingInk" xmlns:wne="http://schemas.microsoft.com/office/word/2006/wordml" xmlns:wps="http://schemas.microsoft.com/office/word/2010/wordprocessingShape" mc:Ignorable="w14 w15 w16se w16cid w16 w16cex w16sdtdh w16sdtfl w16du wp14">
+<w:ftr xmlns:wpc="http://schemas.microsoft.com/office/word/2010/wordprocessingCanvas" xmlns:cx="http://schemas.microsoft.com/office/drawing/2014/chartex" xmlns:cx1="http://schemas.microsoft.com/office/drawing/2015/9/8/chartex" xmlns:cx2="http://schemas.microsoft.com/office/drawing/2015/10/21/chartex" xmlns:cx3="http://schemas.microsoft.com/office/drawing/2016/5/9/chartex" xmlns:cx4="http://schemas.microsoft.com/office/drawing/2016/5/10/chartex" xmlns:cx5="http://schemas.microsoft.com/office/drawing/2016/5/11/chartex" xmlns:cx6="http://schemas.microsoft.com/office/drawing/2016/5/12/chartex" xmlns:cx7="http://schemas.microsoft.com/office/drawing/2016/5/13/chartex" xmlns:cx8="http://schemas.microsoft.com/office/drawing/2016/5/14/chartex" xmlns:mc="http://schemas.openxmlformats.org/markup-compatibility/2006" xmlns:aink="http://schemas.microsoft.com/office/drawing/2016/ink" xmlns:am3d="http://schemas.microsoft.com/office/drawing/2017/model3d" xmlns:o="urn:schemas-microsoft-com:office:office" xmlns:oel="http://schemas.microsoft.com/office/2019/extlst" xmlns:r="http://schemas.openxmlformats.org/officeDocument/2006/relationships" xmlns:m="http://schemas.openxmlformats.org/officeDocument/2006/math" xmlns:v="urn:schemas-microsoft-com:vml" xmlns:wp14="http://schemas.microsoft.com/office/word/2010/wordprocessingDrawing" xmlns:wp="http://schemas.openxmlformats.org/drawingml/2006/wordprocessingDrawing" xmlns:w10="urn:schemas-microsoft-com:office:word" xmlns:w="http://schemas.openxmlformats.org/wordprocessingml/2006/main" xmlns:w14="http://schemas.microsoft.com/office/word/2010/wordml" xmlns:w15="http://schemas.microsoft.com/office/word/2012/wordml" xmlns:w16cex="http://schemas.microsoft.com/office/word/2018/wordml/cex" xmlns:w16cid="http://schemas.microsoft.com/office/word/2016/wordml/cid" xmlns:w16="http://schemas.microsoft.com/office/word/2018/wordml" xmlns:w16sdtdh="http://schemas.microsoft.com/office/word/2020/wordml/sdtdatahash" xmlns:w16se="http://schemas.microsoft.com/office/word/2015/wordml/symex" xmlns:wpg="http://schemas.microsoft.com/office/word/2010/wordprocessingGroup" xmlns:wpi="http://schemas.microsoft.com/office/word/2010/wordprocessingInk" xmlns:wne="http://schemas.microsoft.com/office/word/2006/wordml" xmlns:wps="http://schemas.microsoft.com/office/word/2010/wordprocessingShape" mc:Ignorable="w14 w15 w16se w16cid w16 w16cex w16sdtdh wp14">
   <w:p>
     <w:pPr>
       <w:pBdr>
@@ -7300,7 +6970,7 @@
 </file>
 
 <file path=word/footnotes.xml><?xml version="1.0" encoding="utf-8"?>
-<w:footnotes xmlns:wpc="http://schemas.microsoft.com/office/word/2010/wordprocessingCanvas" xmlns:cx="http://schemas.microsoft.com/office/drawing/2014/chartex" xmlns:cx1="http://schemas.microsoft.com/office/drawing/2015/9/8/chartex" xmlns:cx2="http://schemas.microsoft.com/office/drawing/2015/10/21/chartex" xmlns:cx3="http://schemas.microsoft.com/office/drawing/2016/5/9/chartex" xmlns:cx4="http://schemas.microsoft.com/office/drawing/2016/5/10/chartex" xmlns:cx5="http://schemas.microsoft.com/office/drawing/2016/5/11/chartex" xmlns:cx6="http://schemas.microsoft.com/office/drawing/2016/5/12/chartex" xmlns:cx7="http://schemas.microsoft.com/office/drawing/2016/5/13/chartex" xmlns:cx8="http://schemas.microsoft.com/office/drawing/2016/5/14/chartex" xmlns:mc="http://schemas.openxmlformats.org/markup-compatibility/2006" xmlns:aink="http://schemas.microsoft.com/office/drawing/2016/ink" xmlns:am3d="http://schemas.microsoft.com/office/drawing/2017/model3d" xmlns:o="urn:schemas-microsoft-com:office:office" xmlns:oel="http://schemas.microsoft.com/office/2019/extlst" xmlns:r="http://schemas.openxmlformats.org/officeDocument/2006/relationships" xmlns:m="http://schemas.openxmlformats.org/officeDocument/2006/math" xmlns:v="urn:schemas-microsoft-com:vml" xmlns:wp14="http://schemas.microsoft.com/office/word/2010/wordprocessingDrawing" xmlns:wp="http://schemas.openxmlformats.org/drawingml/2006/wordprocessingDrawing" xmlns:w10="urn:schemas-microsoft-com:office:word" xmlns:w="http://schemas.openxmlformats.org/wordprocessingml/2006/main" xmlns:w14="http://schemas.microsoft.com/office/word/2010/wordml" xmlns:w15="http://schemas.microsoft.com/office/word/2012/wordml" xmlns:w16cex="http://schemas.microsoft.com/office/word/2018/wordml/cex" xmlns:w16cid="http://schemas.microsoft.com/office/word/2016/wordml/cid" xmlns:w16="http://schemas.microsoft.com/office/word/2018/wordml" xmlns:w16du="http://schemas.microsoft.com/office/word/2023/wordml/word16du" xmlns:w16sdtdh="http://schemas.microsoft.com/office/word/2020/wordml/sdtdatahash" xmlns:w16sdtfl="http://schemas.microsoft.com/office/word/2024/wordml/sdtformatlock" xmlns:w16se="http://schemas.microsoft.com/office/word/2015/wordml/symex" xmlns:wpg="http://schemas.microsoft.com/office/word/2010/wordprocessingGroup" xmlns:wpi="http://schemas.microsoft.com/office/word/2010/wordprocessingInk" xmlns:wne="http://schemas.microsoft.com/office/word/2006/wordml" xmlns:wps="http://schemas.microsoft.com/office/word/2010/wordprocessingShape" mc:Ignorable="w14 w15 w16se w16cid w16 w16cex w16sdtdh w16sdtfl w16du wp14">
+<w:footnotes xmlns:wpc="http://schemas.microsoft.com/office/word/2010/wordprocessingCanvas" xmlns:cx="http://schemas.microsoft.com/office/drawing/2014/chartex" xmlns:cx1="http://schemas.microsoft.com/office/drawing/2015/9/8/chartex" xmlns:cx2="http://schemas.microsoft.com/office/drawing/2015/10/21/chartex" xmlns:cx3="http://schemas.microsoft.com/office/drawing/2016/5/9/chartex" xmlns:cx4="http://schemas.microsoft.com/office/drawing/2016/5/10/chartex" xmlns:cx5="http://schemas.microsoft.com/office/drawing/2016/5/11/chartex" xmlns:cx6="http://schemas.microsoft.com/office/drawing/2016/5/12/chartex" xmlns:cx7="http://schemas.microsoft.com/office/drawing/2016/5/13/chartex" xmlns:cx8="http://schemas.microsoft.com/office/drawing/2016/5/14/chartex" xmlns:mc="http://schemas.openxmlformats.org/markup-compatibility/2006" xmlns:aink="http://schemas.microsoft.com/office/drawing/2016/ink" xmlns:am3d="http://schemas.microsoft.com/office/drawing/2017/model3d" xmlns:o="urn:schemas-microsoft-com:office:office" xmlns:oel="http://schemas.microsoft.com/office/2019/extlst" xmlns:r="http://schemas.openxmlformats.org/officeDocument/2006/relationships" xmlns:m="http://schemas.openxmlformats.org/officeDocument/2006/math" xmlns:v="urn:schemas-microsoft-com:vml" xmlns:wp14="http://schemas.microsoft.com/office/word/2010/wordprocessingDrawing" xmlns:wp="http://schemas.openxmlformats.org/drawingml/2006/wordprocessingDrawing" xmlns:w10="urn:schemas-microsoft-com:office:word" xmlns:w="http://schemas.openxmlformats.org/wordprocessingml/2006/main" xmlns:w14="http://schemas.microsoft.com/office/word/2010/wordml" xmlns:w15="http://schemas.microsoft.com/office/word/2012/wordml" xmlns:w16cex="http://schemas.microsoft.com/office/word/2018/wordml/cex" xmlns:w16cid="http://schemas.microsoft.com/office/word/2016/wordml/cid" xmlns:w16="http://schemas.microsoft.com/office/word/2018/wordml" xmlns:w16sdtdh="http://schemas.microsoft.com/office/word/2020/wordml/sdtdatahash" xmlns:w16se="http://schemas.microsoft.com/office/word/2015/wordml/symex" xmlns:wpg="http://schemas.microsoft.com/office/word/2010/wordprocessingGroup" xmlns:wpi="http://schemas.microsoft.com/office/word/2010/wordprocessingInk" xmlns:wne="http://schemas.microsoft.com/office/word/2006/wordml" xmlns:wps="http://schemas.microsoft.com/office/word/2010/wordprocessingShape" mc:Ignorable="w14 w15 w16se w16cid w16 w16cex w16sdtdh wp14">
   <w:footnote w:type="separator" w:id="-1">
     <w:p>
       <w:pPr>
@@ -7325,7 +6995,7 @@
 </file>
 
 <file path=word/header1.xml><?xml version="1.0" encoding="utf-8"?>
-<w:hdr xmlns:wpc="http://schemas.microsoft.com/office/word/2010/wordprocessingCanvas" xmlns:cx="http://schemas.microsoft.com/office/drawing/2014/chartex" xmlns:cx1="http://schemas.microsoft.com/office/drawing/2015/9/8/chartex" xmlns:cx2="http://schemas.microsoft.com/office/drawing/2015/10/21/chartex" xmlns:cx3="http://schemas.microsoft.com/office/drawing/2016/5/9/chartex" xmlns:cx4="http://schemas.microsoft.com/office/drawing/2016/5/10/chartex" xmlns:cx5="http://schemas.microsoft.com/office/drawing/2016/5/11/chartex" xmlns:cx6="http://schemas.microsoft.com/office/drawing/2016/5/12/chartex" xmlns:cx7="http://schemas.microsoft.com/office/drawing/2016/5/13/chartex" xmlns:cx8="http://schemas.microsoft.com/office/drawing/2016/5/14/chartex" xmlns:mc="http://schemas.openxmlformats.org/markup-compatibility/2006" xmlns:aink="http://schemas.microsoft.com/office/drawing/2016/ink" xmlns:am3d="http://schemas.microsoft.com/office/drawing/2017/model3d" xmlns:o="urn:schemas-microsoft-com:office:office" xmlns:oel="http://schemas.microsoft.com/office/2019/extlst" xmlns:r="http://schemas.openxmlformats.org/officeDocument/2006/relationships" xmlns:m="http://schemas.openxmlformats.org/officeDocument/2006/math" xmlns:v="urn:schemas-microsoft-com:vml" xmlns:wp14="http://schemas.microsoft.com/office/word/2010/wordprocessingDrawing" xmlns:wp="http://schemas.openxmlformats.org/drawingml/2006/wordprocessingDrawing" xmlns:w10="urn:schemas-microsoft-com:office:word" xmlns:w="http://schemas.openxmlformats.org/wordprocessingml/2006/main" xmlns:w14="http://schemas.microsoft.com/office/word/2010/wordml" xmlns:w15="http://schemas.microsoft.com/office/word/2012/wordml" xmlns:w16cex="http://schemas.microsoft.com/office/word/2018/wordml/cex" xmlns:w16cid="http://schemas.microsoft.com/office/word/2016/wordml/cid" xmlns:w16="http://schemas.microsoft.com/office/word/2018/wordml" xmlns:w16du="http://schemas.microsoft.com/office/word/2023/wordml/word16du" xmlns:w16sdtdh="http://schemas.microsoft.com/office/word/2020/wordml/sdtdatahash" xmlns:w16sdtfl="http://schemas.microsoft.com/office/word/2024/wordml/sdtformatlock" xmlns:w16se="http://schemas.microsoft.com/office/word/2015/wordml/symex" xmlns:wpg="http://schemas.microsoft.com/office/word/2010/wordprocessingGroup" xmlns:wpi="http://schemas.microsoft.com/office/word/2010/wordprocessingInk" xmlns:wne="http://schemas.microsoft.com/office/word/2006/wordml" xmlns:wps="http://schemas.microsoft.com/office/word/2010/wordprocessingShape" mc:Ignorable="w14 w15 w16se w16cid w16 w16cex w16sdtdh w16sdtfl w16du wp14">
+<w:hdr xmlns:wpc="http://schemas.microsoft.com/office/word/2010/wordprocessingCanvas" xmlns:cx="http://schemas.microsoft.com/office/drawing/2014/chartex" xmlns:cx1="http://schemas.microsoft.com/office/drawing/2015/9/8/chartex" xmlns:cx2="http://schemas.microsoft.com/office/drawing/2015/10/21/chartex" xmlns:cx3="http://schemas.microsoft.com/office/drawing/2016/5/9/chartex" xmlns:cx4="http://schemas.microsoft.com/office/drawing/2016/5/10/chartex" xmlns:cx5="http://schemas.microsoft.com/office/drawing/2016/5/11/chartex" xmlns:cx6="http://schemas.microsoft.com/office/drawing/2016/5/12/chartex" xmlns:cx7="http://schemas.microsoft.com/office/drawing/2016/5/13/chartex" xmlns:cx8="http://schemas.microsoft.com/office/drawing/2016/5/14/chartex" xmlns:mc="http://schemas.openxmlformats.org/markup-compatibility/2006" xmlns:aink="http://schemas.microsoft.com/office/drawing/2016/ink" xmlns:am3d="http://schemas.microsoft.com/office/drawing/2017/model3d" xmlns:o="urn:schemas-microsoft-com:office:office" xmlns:oel="http://schemas.microsoft.com/office/2019/extlst" xmlns:r="http://schemas.openxmlformats.org/officeDocument/2006/relationships" xmlns:m="http://schemas.openxmlformats.org/officeDocument/2006/math" xmlns:v="urn:schemas-microsoft-com:vml" xmlns:wp14="http://schemas.microsoft.com/office/word/2010/wordprocessingDrawing" xmlns:wp="http://schemas.openxmlformats.org/drawingml/2006/wordprocessingDrawing" xmlns:w10="urn:schemas-microsoft-com:office:word" xmlns:w="http://schemas.openxmlformats.org/wordprocessingml/2006/main" xmlns:w14="http://schemas.microsoft.com/office/word/2010/wordml" xmlns:w15="http://schemas.microsoft.com/office/word/2012/wordml" xmlns:w16cex="http://schemas.microsoft.com/office/word/2018/wordml/cex" xmlns:w16cid="http://schemas.microsoft.com/office/word/2016/wordml/cid" xmlns:w16="http://schemas.microsoft.com/office/word/2018/wordml" xmlns:w16sdtdh="http://schemas.microsoft.com/office/word/2020/wordml/sdtdatahash" xmlns:w16se="http://schemas.microsoft.com/office/word/2015/wordml/symex" xmlns:wpg="http://schemas.microsoft.com/office/word/2010/wordprocessingGroup" xmlns:wpi="http://schemas.microsoft.com/office/word/2010/wordprocessingInk" xmlns:wne="http://schemas.microsoft.com/office/word/2006/wordml" xmlns:wps="http://schemas.microsoft.com/office/word/2010/wordprocessingShape" mc:Ignorable="w14 w15 w16se w16cid w16 w16cex w16sdtdh wp14">
   <w:p>
     <w:pPr>
       <w:pBdr>
@@ -7372,7 +7042,7 @@
 </file>
 
 <file path=word/numbering.xml><?xml version="1.0" encoding="utf-8"?>
-<w:numbering xmlns:wpc="http://schemas.microsoft.com/office/word/2010/wordprocessingCanvas" xmlns:cx="http://schemas.microsoft.com/office/drawing/2014/chartex" xmlns:cx1="http://schemas.microsoft.com/office/drawing/2015/9/8/chartex" xmlns:cx2="http://schemas.microsoft.com/office/drawing/2015/10/21/chartex" xmlns:cx3="http://schemas.microsoft.com/office/drawing/2016/5/9/chartex" xmlns:cx4="http://schemas.microsoft.com/office/drawing/2016/5/10/chartex" xmlns:cx5="http://schemas.microsoft.com/office/drawing/2016/5/11/chartex" xmlns:cx6="http://schemas.microsoft.com/office/drawing/2016/5/12/chartex" xmlns:cx7="http://schemas.microsoft.com/office/drawing/2016/5/13/chartex" xmlns:cx8="http://schemas.microsoft.com/office/drawing/2016/5/14/chartex" xmlns:mc="http://schemas.openxmlformats.org/markup-compatibility/2006" xmlns:aink="http://schemas.microsoft.com/office/drawing/2016/ink" xmlns:am3d="http://schemas.microsoft.com/office/drawing/2017/model3d" xmlns:o="urn:schemas-microsoft-com:office:office" xmlns:oel="http://schemas.microsoft.com/office/2019/extlst" xmlns:r="http://schemas.openxmlformats.org/officeDocument/2006/relationships" xmlns:m="http://schemas.openxmlformats.org/officeDocument/2006/math" xmlns:v="urn:schemas-microsoft-com:vml" xmlns:wp14="http://schemas.microsoft.com/office/word/2010/wordprocessingDrawing" xmlns:wp="http://schemas.openxmlformats.org/drawingml/2006/wordprocessingDrawing" xmlns:w10="urn:schemas-microsoft-com:office:word" xmlns:w="http://schemas.openxmlformats.org/wordprocessingml/2006/main" xmlns:w14="http://schemas.microsoft.com/office/word/2010/wordml" xmlns:w15="http://schemas.microsoft.com/office/word/2012/wordml" xmlns:w16cex="http://schemas.microsoft.com/office/word/2018/wordml/cex" xmlns:w16cid="http://schemas.microsoft.com/office/word/2016/wordml/cid" xmlns:w16="http://schemas.microsoft.com/office/word/2018/wordml" xmlns:w16du="http://schemas.microsoft.com/office/word/2023/wordml/word16du" xmlns:w16sdtdh="http://schemas.microsoft.com/office/word/2020/wordml/sdtdatahash" xmlns:w16sdtfl="http://schemas.microsoft.com/office/word/2024/wordml/sdtformatlock" xmlns:w16se="http://schemas.microsoft.com/office/word/2015/wordml/symex" xmlns:wpg="http://schemas.microsoft.com/office/word/2010/wordprocessingGroup" xmlns:wpi="http://schemas.microsoft.com/office/word/2010/wordprocessingInk" xmlns:wne="http://schemas.microsoft.com/office/word/2006/wordml" xmlns:wps="http://schemas.microsoft.com/office/word/2010/wordprocessingShape" mc:Ignorable="w14 w15 w16se w16cid w16 w16cex w16sdtdh w16sdtfl w16du wp14">
+<w:numbering xmlns:wpc="http://schemas.microsoft.com/office/word/2010/wordprocessingCanvas" xmlns:cx="http://schemas.microsoft.com/office/drawing/2014/chartex" xmlns:cx1="http://schemas.microsoft.com/office/drawing/2015/9/8/chartex" xmlns:cx2="http://schemas.microsoft.com/office/drawing/2015/10/21/chartex" xmlns:cx3="http://schemas.microsoft.com/office/drawing/2016/5/9/chartex" xmlns:cx4="http://schemas.microsoft.com/office/drawing/2016/5/10/chartex" xmlns:cx5="http://schemas.microsoft.com/office/drawing/2016/5/11/chartex" xmlns:cx6="http://schemas.microsoft.com/office/drawing/2016/5/12/chartex" xmlns:cx7="http://schemas.microsoft.com/office/drawing/2016/5/13/chartex" xmlns:cx8="http://schemas.microsoft.com/office/drawing/2016/5/14/chartex" xmlns:mc="http://schemas.openxmlformats.org/markup-compatibility/2006" xmlns:aink="http://schemas.microsoft.com/office/drawing/2016/ink" xmlns:am3d="http://schemas.microsoft.com/office/drawing/2017/model3d" xmlns:o="urn:schemas-microsoft-com:office:office" xmlns:oel="http://schemas.microsoft.com/office/2019/extlst" xmlns:r="http://schemas.openxmlformats.org/officeDocument/2006/relationships" xmlns:m="http://schemas.openxmlformats.org/officeDocument/2006/math" xmlns:v="urn:schemas-microsoft-com:vml" xmlns:wp14="http://schemas.microsoft.com/office/word/2010/wordprocessingDrawing" xmlns:wp="http://schemas.openxmlformats.org/drawingml/2006/wordprocessingDrawing" xmlns:w10="urn:schemas-microsoft-com:office:word" xmlns:w="http://schemas.openxmlformats.org/wordprocessingml/2006/main" xmlns:w14="http://schemas.microsoft.com/office/word/2010/wordml" xmlns:w15="http://schemas.microsoft.com/office/word/2012/wordml" xmlns:w16cex="http://schemas.microsoft.com/office/word/2018/wordml/cex" xmlns:w16cid="http://schemas.microsoft.com/office/word/2016/wordml/cid" xmlns:w16="http://schemas.microsoft.com/office/word/2018/wordml" xmlns:w16sdtdh="http://schemas.microsoft.com/office/word/2020/wordml/sdtdatahash" xmlns:w16se="http://schemas.microsoft.com/office/word/2015/wordml/symex" xmlns:wpg="http://schemas.microsoft.com/office/word/2010/wordprocessingGroup" xmlns:wpi="http://schemas.microsoft.com/office/word/2010/wordprocessingInk" xmlns:wne="http://schemas.microsoft.com/office/word/2006/wordml" xmlns:wps="http://schemas.microsoft.com/office/word/2010/wordprocessingShape" mc:Ignorable="w14 w15 w16se w16cid w16 w16cex w16sdtdh wp14">
   <w:abstractNum w:abstractNumId="0" w15:restartNumberingAfterBreak="0">
     <w:nsid w:val="676B5035"/>
     <w:multiLevelType w:val="multilevel"/>
@@ -7466,7 +7136,7 @@
 </file>
 
 <file path=word/styles.xml><?xml version="1.0" encoding="utf-8"?>
-<w:styles xmlns:mc="http://schemas.openxmlformats.org/markup-compatibility/2006" xmlns:r="http://schemas.openxmlformats.org/officeDocument/2006/relationships" xmlns:w="http://schemas.openxmlformats.org/wordprocessingml/2006/main" xmlns:w14="http://schemas.microsoft.com/office/word/2010/wordml" xmlns:w15="http://schemas.microsoft.com/office/word/2012/wordml" xmlns:w16cex="http://schemas.microsoft.com/office/word/2018/wordml/cex" xmlns:w16cid="http://schemas.microsoft.com/office/word/2016/wordml/cid" xmlns:w16="http://schemas.microsoft.com/office/word/2018/wordml" xmlns:w16du="http://schemas.microsoft.com/office/word/2023/wordml/word16du" xmlns:w16sdtdh="http://schemas.microsoft.com/office/word/2020/wordml/sdtdatahash" xmlns:w16sdtfl="http://schemas.microsoft.com/office/word/2024/wordml/sdtformatlock" xmlns:w16se="http://schemas.microsoft.com/office/word/2015/wordml/symex" mc:Ignorable="w14 w15 w16se w16cid w16 w16cex w16sdtdh w16sdtfl w16du">
+<w:styles xmlns:mc="http://schemas.openxmlformats.org/markup-compatibility/2006" xmlns:r="http://schemas.openxmlformats.org/officeDocument/2006/relationships" xmlns:w="http://schemas.openxmlformats.org/wordprocessingml/2006/main" xmlns:w14="http://schemas.microsoft.com/office/word/2010/wordml" xmlns:w15="http://schemas.microsoft.com/office/word/2012/wordml" xmlns:w16cex="http://schemas.microsoft.com/office/word/2018/wordml/cex" xmlns:w16cid="http://schemas.microsoft.com/office/word/2016/wordml/cid" xmlns:w16="http://schemas.microsoft.com/office/word/2018/wordml" xmlns:w16sdtdh="http://schemas.microsoft.com/office/word/2020/wordml/sdtdatahash" xmlns:w16se="http://schemas.microsoft.com/office/word/2015/wordml/symex" mc:Ignorable="w14 w15 w16se w16cid w16 w16cex w16sdtdh">
   <w:docDefaults>
     <w:rPrDefault>
       <w:rPr>
@@ -7861,14 +7531,14 @@
     <w:lsdException w:name="Unresolved Mention" w:semiHidden="1" w:unhideWhenUsed="1"/>
     <w:lsdException w:name="Smart Link" w:semiHidden="1" w:unhideWhenUsed="1"/>
   </w:latentStyles>
-  <w:style w:type="paragraph" w:default="1" w:styleId="Normale">
+  <w:style w:type="paragraph" w:default="1" w:styleId="Normal">
     <w:name w:val="Normal"/>
     <w:qFormat/>
   </w:style>
-  <w:style w:type="paragraph" w:styleId="Titolo1">
+  <w:style w:type="paragraph" w:styleId="Ttulo1">
     <w:name w:val="heading 1"/>
-    <w:basedOn w:val="Normale"/>
-    <w:next w:val="Normale"/>
+    <w:basedOn w:val="Normal"/>
+    <w:next w:val="Normal"/>
     <w:uiPriority w:val="9"/>
     <w:qFormat/>
     <w:pPr>
@@ -7885,10 +7555,10 @@
       <w:szCs w:val="28"/>
     </w:rPr>
   </w:style>
-  <w:style w:type="paragraph" w:styleId="Titolo2">
+  <w:style w:type="paragraph" w:styleId="Ttulo2">
     <w:name w:val="heading 2"/>
-    <w:basedOn w:val="Normale"/>
-    <w:next w:val="Normale"/>
+    <w:basedOn w:val="Normal"/>
+    <w:next w:val="Normal"/>
     <w:uiPriority w:val="9"/>
     <w:semiHidden/>
     <w:unhideWhenUsed/>
@@ -7907,10 +7577,10 @@
       <w:szCs w:val="24"/>
     </w:rPr>
   </w:style>
-  <w:style w:type="paragraph" w:styleId="Titolo3">
+  <w:style w:type="paragraph" w:styleId="Ttulo3">
     <w:name w:val="heading 3"/>
-    <w:basedOn w:val="Normale"/>
-    <w:next w:val="Normale"/>
+    <w:basedOn w:val="Normal"/>
+    <w:next w:val="Normal"/>
     <w:uiPriority w:val="9"/>
     <w:semiHidden/>
     <w:unhideWhenUsed/>
@@ -7924,10 +7594,10 @@
       <w:color w:val="006666"/>
     </w:rPr>
   </w:style>
-  <w:style w:type="paragraph" w:styleId="Titolo4">
+  <w:style w:type="paragraph" w:styleId="Ttulo4">
     <w:name w:val="heading 4"/>
-    <w:basedOn w:val="Normale"/>
-    <w:next w:val="Normale"/>
+    <w:basedOn w:val="Normal"/>
+    <w:next w:val="Normal"/>
     <w:uiPriority w:val="9"/>
     <w:semiHidden/>
     <w:unhideWhenUsed/>
@@ -7941,10 +7611,10 @@
       <w:color w:val="006666"/>
     </w:rPr>
   </w:style>
-  <w:style w:type="paragraph" w:styleId="Titolo5">
+  <w:style w:type="paragraph" w:styleId="Ttulo5">
     <w:name w:val="heading 5"/>
-    <w:basedOn w:val="Normale"/>
-    <w:next w:val="Normale"/>
+    <w:basedOn w:val="Normal"/>
+    <w:next w:val="Normal"/>
     <w:uiPriority w:val="9"/>
     <w:semiHidden/>
     <w:unhideWhenUsed/>
@@ -7962,10 +7632,10 @@
       <w:color w:val="006666"/>
     </w:rPr>
   </w:style>
-  <w:style w:type="paragraph" w:styleId="Titolo6">
+  <w:style w:type="paragraph" w:styleId="Ttulo6">
     <w:name w:val="heading 6"/>
-    <w:basedOn w:val="Normale"/>
-    <w:next w:val="Normale"/>
+    <w:basedOn w:val="Normal"/>
+    <w:next w:val="Normal"/>
     <w:uiPriority w:val="9"/>
     <w:semiHidden/>
     <w:unhideWhenUsed/>
@@ -7981,13 +7651,13 @@
       <w:color w:val="006666"/>
     </w:rPr>
   </w:style>
-  <w:style w:type="character" w:default="1" w:styleId="Carpredefinitoparagrafo">
+  <w:style w:type="character" w:default="1" w:styleId="Fuentedeprrafopredeter">
     <w:name w:val="Default Paragraph Font"/>
     <w:uiPriority w:val="1"/>
     <w:semiHidden/>
     <w:unhideWhenUsed/>
   </w:style>
-  <w:style w:type="table" w:default="1" w:styleId="Tabellanormale">
+  <w:style w:type="table" w:default="1" w:styleId="Tablanormal">
     <w:name w:val="Normal Table"/>
     <w:uiPriority w:val="99"/>
     <w:semiHidden/>
@@ -8002,7 +7672,7 @@
       </w:tblCellMar>
     </w:tblPr>
   </w:style>
-  <w:style w:type="numbering" w:default="1" w:styleId="Nessunelenco">
+  <w:style w:type="numbering" w:default="1" w:styleId="Sinlista">
     <w:name w:val="No List"/>
     <w:uiPriority w:val="99"/>
     <w:semiHidden/>
@@ -8019,10 +7689,10 @@
       </w:tblCellMar>
     </w:tblPr>
   </w:style>
-  <w:style w:type="paragraph" w:styleId="Titolo">
+  <w:style w:type="paragraph" w:styleId="Ttulo">
     <w:name w:val="Title"/>
-    <w:basedOn w:val="Normale"/>
-    <w:next w:val="Normale"/>
+    <w:basedOn w:val="Normal"/>
+    <w:next w:val="Normal"/>
     <w:uiPriority w:val="10"/>
     <w:qFormat/>
     <w:pPr>
@@ -8039,10 +7709,10 @@
       <w:szCs w:val="36"/>
     </w:rPr>
   </w:style>
-  <w:style w:type="paragraph" w:styleId="Sottotitolo">
+  <w:style w:type="paragraph" w:styleId="Subttulo">
     <w:name w:val="Subtitle"/>
-    <w:basedOn w:val="Normale"/>
-    <w:next w:val="Normale"/>
+    <w:basedOn w:val="Normal"/>
+    <w:next w:val="Normal"/>
     <w:uiPriority w:val="11"/>
     <w:qFormat/>
     <w:rPr>
@@ -8444,6 +8114,23 @@
 </file>
 
 <file path=customXml/item1.xml><?xml version="1.0" encoding="utf-8"?>
+<p:properties xmlns:p="http://schemas.microsoft.com/office/2006/metadata/properties" xmlns:xsi="http://www.w3.org/2001/XMLSchema-instance" xmlns:pc="http://schemas.microsoft.com/office/infopath/2007/PartnerControls">
+  <documentManagement>
+    <_activity xmlns="301db74d-c744-4ced-b9a1-6410a2640a47" xsi:nil="true"/>
+  </documentManagement>
+</p:properties>
+</file>
+
+<file path=customXml/item2.xml><?xml version="1.0" encoding="utf-8"?>
+<?mso-contentType ?>
+<FormTemplates xmlns="http://schemas.microsoft.com/sharepoint/v3/contenttype/forms">
+  <Display>DocumentLibraryForm</Display>
+  <Edit>DocumentLibraryForm</Edit>
+  <New>DocumentLibraryForm</New>
+</FormTemplates>
+</file>
+
+<file path=customXml/item3.xml><?xml version="1.0" encoding="utf-8"?>
 <ct:contentTypeSchema xmlns:ct="http://schemas.microsoft.com/office/2006/metadata/contentType" xmlns:ma="http://schemas.microsoft.com/office/2006/metadata/properties/metaAttributes" ct:_="" ma:_="" ma:contentTypeName="Documento" ma:contentTypeID="0x010100FE4D1B6DE87E804A8402DB6040C67B06" ma:contentTypeVersion="18" ma:contentTypeDescription="Creare un nuovo documento." ma:contentTypeScope="" ma:versionID="349c1e474ee2ff2495d9916ef05700cf">
   <xsd:schema xmlns:xsd="http://www.w3.org/2001/XMLSchema" xmlns:xs="http://www.w3.org/2001/XMLSchema" xmlns:p="http://schemas.microsoft.com/office/2006/metadata/properties" xmlns:ns3="301db74d-c744-4ced-b9a1-6410a2640a47" xmlns:ns4="954652f8-67e4-47b7-ac83-2d745dee71ed" targetNamespace="http://schemas.microsoft.com/office/2006/metadata/properties" ma:root="true" ma:fieldsID="bf5ea9a4f9e327ae87c73c8c63fe8d18" ns3:_="" ns4:_="">
     <xsd:import namespace="301db74d-c744-4ced-b9a1-6410a2640a47"/>
@@ -8696,24 +8383,25 @@
 </ct:contentTypeSchema>
 </file>
 
-<file path=customXml/item2.xml><?xml version="1.0" encoding="utf-8"?>
-<?mso-contentType ?>
-<FormTemplates xmlns="http://schemas.microsoft.com/sharepoint/v3/contenttype/forms">
-  <Display>DocumentLibraryForm</Display>
-  <Edit>DocumentLibraryForm</Edit>
-  <New>DocumentLibraryForm</New>
-</FormTemplates>
+<file path=customXml/itemProps1.xml><?xml version="1.0" encoding="utf-8"?>
+<ds:datastoreItem xmlns:ds="http://schemas.openxmlformats.org/officeDocument/2006/customXml" ds:itemID="{852E5C69-D103-4CEF-A55D-6EDC334E3E0B}">
+  <ds:schemaRefs>
+    <ds:schemaRef ds:uri="http://schemas.microsoft.com/office/2006/metadata/properties"/>
+    <ds:schemaRef ds:uri="http://schemas.microsoft.com/office/infopath/2007/PartnerControls"/>
+    <ds:schemaRef ds:uri="301db74d-c744-4ced-b9a1-6410a2640a47"/>
+  </ds:schemaRefs>
+</ds:datastoreItem>
 </file>
 
-<file path=customXml/item3.xml><?xml version="1.0" encoding="utf-8"?>
-<p:properties xmlns:p="http://schemas.microsoft.com/office/2006/metadata/properties" xmlns:xsi="http://www.w3.org/2001/XMLSchema-instance" xmlns:pc="http://schemas.microsoft.com/office/infopath/2007/PartnerControls">
-  <documentManagement>
-    <_activity xmlns="301db74d-c744-4ced-b9a1-6410a2640a47" xsi:nil="true"/>
-  </documentManagement>
-</p:properties>
+<file path=customXml/itemProps2.xml><?xml version="1.0" encoding="utf-8"?>
+<ds:datastoreItem xmlns:ds="http://schemas.openxmlformats.org/officeDocument/2006/customXml" ds:itemID="{06D45954-17E9-4DDD-A30A-A46F48B1BC8F}">
+  <ds:schemaRefs>
+    <ds:schemaRef ds:uri="http://schemas.microsoft.com/sharepoint/v3/contenttype/forms"/>
+  </ds:schemaRefs>
+</ds:datastoreItem>
 </file>
 
-<file path=customXml/itemProps1.xml><?xml version="1.0" encoding="utf-8"?>
+<file path=customXml/itemProps3.xml><?xml version="1.0" encoding="utf-8"?>
 <ds:datastoreItem xmlns:ds="http://schemas.openxmlformats.org/officeDocument/2006/customXml" ds:itemID="{91280922-7015-4785-BA5F-EA211F8E3DCC}">
   <ds:schemaRefs>
     <ds:schemaRef ds:uri="http://schemas.microsoft.com/office/2006/metadata/contentType"/>
@@ -8732,24 +8420,6 @@
 </ds:datastoreItem>
 </file>
 
-<file path=customXml/itemProps2.xml><?xml version="1.0" encoding="utf-8"?>
-<ds:datastoreItem xmlns:ds="http://schemas.openxmlformats.org/officeDocument/2006/customXml" ds:itemID="{06D45954-17E9-4DDD-A30A-A46F48B1BC8F}">
-  <ds:schemaRefs>
-    <ds:schemaRef ds:uri="http://schemas.microsoft.com/sharepoint/v3/contenttype/forms"/>
-  </ds:schemaRefs>
-</ds:datastoreItem>
-</file>
-
-<file path=customXml/itemProps3.xml><?xml version="1.0" encoding="utf-8"?>
-<ds:datastoreItem xmlns:ds="http://schemas.openxmlformats.org/officeDocument/2006/customXml" ds:itemID="{852E5C69-D103-4CEF-A55D-6EDC334E3E0B}">
-  <ds:schemaRefs>
-    <ds:schemaRef ds:uri="http://schemas.microsoft.com/office/2006/metadata/properties"/>
-    <ds:schemaRef ds:uri="http://schemas.microsoft.com/office/infopath/2007/PartnerControls"/>
-    <ds:schemaRef ds:uri="301db74d-c744-4ced-b9a1-6410a2640a47"/>
-  </ds:schemaRefs>
-</ds:datastoreItem>
-</file>
-
 <file path=docMetadata/LabelInfo.xml><?xml version="1.0" encoding="utf-8"?>
 <clbl:labelList xmlns:clbl="http://schemas.microsoft.com/office/2020/mipLabelMetadata">
   <clbl:label id="{f2d7d6c5-1bee-41ff-9e79-b372a5cce71d}" enabled="0" method="" siteId="{f2d7d6c5-1bee-41ff-9e79-b372a5cce71d}" removed="1"/>

</xml_diff>